<commit_message>
Actualizar protocolo para Hospital General Puyo con logo MSP
Mejora la gráfica de flujo con texto completo y legible, incorpora
el logo del Ministerio de Salud Pública y adapta el documento al
Hospital General Puyo.

Co-authored-by: subdirecadmi2026 <subdirecadmi2026@users.noreply.github.com>
</commit_message>
<xml_diff>
--- a/docs/historia-clinica-ecuador/PROTOCOLO_PERDIDA_HISTORIA_CLINICA_PROT-HC-001.docx
+++ b/docs/historia-clinica-ecuador/PROTOCOLO_PERDIDA_HISTORIA_CLINICA_PROT-HC-001.docx
@@ -16,10 +16,10 @@
             <w:tcW w:type="dxa" w:w="10200"/>
             <w:shd w:fill="0B2C4A" w:val="clear"/>
             <w:tcMar>
-              <w:top w:w="28" w:type="dxa"/>
-              <w:left w:w="70" w:type="dxa"/>
-              <w:bottom w:w="28" w:type="dxa"/>
-              <w:right w:w="70" w:type="dxa"/>
+              <w:top w:w="40" w:type="dxa"/>
+              <w:left w:w="60" w:type="dxa"/>
+              <w:bottom w:w="40" w:type="dxa"/>
+              <w:right w:w="60" w:type="dxa"/>
             </w:tcMar>
           </w:tcPr>
           <w:p>
@@ -28,14 +28,53 @@
             </w:pPr>
             <w:r/>
             <w:r>
+              <w:drawing>
+                <wp:inline xmlns:a="http://schemas.openxmlformats.org/drawingml/2006/main" xmlns:pic="http://schemas.openxmlformats.org/drawingml/2006/picture">
+                  <wp:extent cx="3420000" cy="1050723"/>
+                  <wp:docPr id="1" name="Picture 1"/>
+                  <wp:cNvGraphicFramePr>
+                    <a:graphicFrameLocks noChangeAspect="1"/>
+                  </wp:cNvGraphicFramePr>
+                  <a:graphic>
+                    <a:graphicData uri="http://schemas.openxmlformats.org/drawingml/2006/picture">
+                      <pic:pic>
+                        <pic:nvPicPr>
+                          <pic:cNvPr id="0" name="logo_msp_header.png"/>
+                          <pic:cNvPicPr/>
+                        </pic:nvPicPr>
+                        <pic:blipFill>
+                          <a:blip r:embed="rId9"/>
+                          <a:stretch>
+                            <a:fillRect/>
+                          </a:stretch>
+                        </pic:blipFill>
+                        <pic:spPr>
+                          <a:xfrm>
+                            <a:off x="0" y="0"/>
+                            <a:ext cx="3420000" cy="1050723"/>
+                          </a:xfrm>
+                          <a:prstGeom prst="rect"/>
+                        </pic:spPr>
+                      </pic:pic>
+                    </a:graphicData>
+                  </a:graphic>
+                </wp:inline>
+              </w:drawing>
+            </w:r>
+          </w:p>
+          <w:p>
+            <w:pPr>
+              <w:jc w:val="center"/>
+            </w:pPr>
+            <w:r>
               <w:rPr>
                 <w:rFonts w:ascii="Calibri" w:hAnsi="Calibri" w:eastAsia="Calibri"/>
                 <w:b/>
                 <w:i w:val="0"/>
                 <w:color w:val="FFFFFF"/>
-                <w:sz w:val="16"/>
+                <w:sz w:val="18"/>
               </w:rPr>
-              <w:t>DOCUMENTO INSTITUCIONAL DE CALIDAD Y SEGURIDAD DEL PACIENTE</w:t>
+              <w:t>MINISTERIO DE SALUD PÚBLICA DEL ECUADOR</w:t>
             </w:r>
           </w:p>
         </w:tc>
@@ -43,18 +82,18 @@
     </w:tbl>
     <w:p>
       <w:pPr>
-        <w:spacing w:before="160" w:after="0" w:line="259" w:lineRule="auto"/>
+        <w:spacing w:before="200" w:after="40" w:line="259" w:lineRule="auto"/>
         <w:jc w:val="center"/>
       </w:pPr>
       <w:r>
         <w:rPr>
-          <w:rFonts w:ascii="Calibri" w:hAnsi="Calibri" w:eastAsia="Calibri"/>
-          <w:b w:val="0"/>
+          <w:rFonts w:ascii="Georgia" w:hAnsi="Georgia" w:eastAsia="Georgia"/>
+          <w:b/>
           <w:i w:val="0"/>
           <w:color w:val="0D6E6E"/>
-          <w:sz w:val="44"/>
+          <w:sz w:val="28"/>
         </w:rPr>
-        <w:t>✚</w:t>
+        <w:t>HOSPITAL GENERAL PUYO</w:t>
       </w:r>
     </w:p>
     <w:p>
@@ -84,7 +123,7 @@
           <w:b/>
           <w:i w:val="0"/>
           <w:color w:val="0B2C4A"/>
-          <w:sz w:val="32"/>
+          <w:sz w:val="30"/>
         </w:rPr>
         <w:t>Pérdida, Extravío o Deterioro de Historia Clínica</w:t>
       </w:r>
@@ -126,7 +165,7 @@
           <w:color w:val="4A5563"/>
           <w:sz w:val="16"/>
         </w:rPr>
-        <w:t>Ámbito: Establecimientos de salud del Sistema Nacional de Salud</w:t>
+        <w:t>Establecimiento: Hospital General Puyo  ·  Sistema Nacional de Salud</w:t>
       </w:r>
     </w:p>
     <w:tbl>
@@ -512,9 +551,6 @@
             </w:tcMar>
           </w:tcPr>
           <w:p>
-            <w:pPr>
-              <w:spacing w:before="0" w:after="0"/>
-            </w:pPr>
             <w:r/>
             <w:r>
               <w:rPr>
@@ -524,7 +560,7 @@
                 <w:color w:val="0D6E6E"/>
                 <w:sz w:val="18"/>
               </w:rPr>
-              <w:t>⚠  USO INSTITUCIONAL</w:t>
+              <w:t>⚠  USO INSTITUCIONAL — HOSPITAL GENERAL PUYO</w:t>
               <w:br/>
             </w:r>
             <w:r>
@@ -535,7 +571,7 @@
                 <w:color w:val="4A5563"/>
                 <w:sz w:val="18"/>
               </w:rPr>
-              <w:t>Cumplimiento obligatorio para personal de la cadena sanitaria y administrativo que custodie o maneje historias clínicas. Base: Acdo. 00115-2021 (Arts. 13–19) y Acdo. 00005216-A.</w:t>
+              <w:t>Cumplimiento obligatorio para el personal de la cadena sanitaria y administrativo que custodie o maneje historias clínicas en el Hospital General Puyo. Base: Acdo. MSP 00115-2021 (Arts. 13–19) y Acdo. 00005216-A.</w:t>
             </w:r>
           </w:p>
         </w:tc>
@@ -611,9 +647,6 @@
             </w:tcMar>
           </w:tcPr>
           <w:p>
-            <w:pPr>
-              <w:spacing w:before="0" w:after="0"/>
-            </w:pPr>
             <w:r/>
             <w:r>
               <w:rPr>
@@ -631,7 +664,7 @@
     </w:tbl>
     <w:p>
       <w:pPr>
-        <w:spacing w:before="0" w:after="80"/>
+        <w:spacing w:after="80"/>
       </w:pPr>
     </w:p>
     <w:tbl>
@@ -1373,9 +1406,6 @@
             </w:tcMar>
           </w:tcPr>
           <w:p>
-            <w:pPr>
-              <w:spacing w:before="0" w:after="0"/>
-            </w:pPr>
             <w:r/>
             <w:r>
               <w:rPr>
@@ -1393,7 +1423,7 @@
     </w:tbl>
     <w:p>
       <w:pPr>
-        <w:spacing w:before="0" w:after="80"/>
+        <w:spacing w:after="80"/>
       </w:pPr>
     </w:p>
     <w:p>
@@ -1409,7 +1439,7 @@
           <w:color w:val="4A5563"/>
           <w:sz w:val="20"/>
         </w:rPr>
-        <w:t>Establecer el procedimiento institucional ante la pérdida, extravío, deterioro, destrucción parcial o total, o indisponibilidad de la historia clínica (física, digital o electrónica), a fin de:</w:t>
+        <w:t>Establecer el procedimiento del Hospital General Puyo ante la pérdida, extravío, deterioro, destrucción parcial o total, o indisponibilidad de la historia clínica (física, digital o electrónica), a fin de:</w:t>
       </w:r>
     </w:p>
     <w:p>
@@ -1537,9 +1567,6 @@
             </w:tcMar>
           </w:tcPr>
           <w:p>
-            <w:pPr>
-              <w:spacing w:before="0" w:after="0"/>
-            </w:pPr>
             <w:r/>
             <w:r>
               <w:rPr>
@@ -1557,7 +1584,7 @@
     </w:tbl>
     <w:p>
       <w:pPr>
-        <w:spacing w:before="0" w:after="80"/>
+        <w:spacing w:after="80"/>
       </w:pPr>
     </w:p>
     <w:p>
@@ -1573,7 +1600,7 @@
           <w:color w:val="4A5563"/>
           <w:sz w:val="20"/>
         </w:rPr>
-        <w:t>Aplica a todo el personal de la cadena sanitaria y administrativo del establecimiento que custodie, maneje, traslade o archive historias clínicas y documentación clínica relacionada, en cualquier soporte.</w:t>
+        <w:t>Aplica a todo el personal de la cadena sanitaria y administrativo del Hospital General Puyo que custodie, maneje, traslade o archive historias clínicas y documentación clínica relacionada, en cualquier soporte.</w:t>
       </w:r>
     </w:p>
     <w:tbl>
@@ -1597,9 +1624,6 @@
             </w:tcMar>
           </w:tcPr>
           <w:p>
-            <w:pPr>
-              <w:spacing w:before="0" w:after="0"/>
-            </w:pPr>
             <w:r/>
             <w:r>
               <w:rPr>
@@ -1617,7 +1641,7 @@
     </w:tbl>
     <w:p>
       <w:pPr>
-        <w:spacing w:before="0" w:after="80"/>
+        <w:spacing w:after="80"/>
       </w:pPr>
     </w:p>
     <w:tbl>
@@ -2219,9 +2243,6 @@
             </w:tcMar>
           </w:tcPr>
           <w:p>
-            <w:pPr>
-              <w:spacing w:before="0" w:after="0"/>
-            </w:pPr>
             <w:r/>
             <w:r>
               <w:rPr>
@@ -2239,7 +2260,7 @@
     </w:tbl>
     <w:p>
       <w:pPr>
-        <w:spacing w:before="0" w:after="80"/>
+        <w:spacing w:after="80"/>
       </w:pPr>
     </w:p>
     <w:tbl>
@@ -2355,7 +2376,7 @@
                 <w:color w:val="4A5563"/>
                 <w:sz w:val="16"/>
               </w:rPr>
-              <w:t>Máxima autoridad del establecimiento</w:t>
+              <w:t>Máxima autoridad del Hospital General Puyo</w:t>
             </w:r>
           </w:p>
         </w:tc>
@@ -2841,9 +2862,6 @@
             </w:tcMar>
           </w:tcPr>
           <w:p>
-            <w:pPr>
-              <w:spacing w:before="0" w:after="0"/>
-            </w:pPr>
             <w:r/>
             <w:r>
               <w:rPr>
@@ -2861,7 +2879,7 @@
     </w:tbl>
     <w:p>
       <w:pPr>
-        <w:spacing w:before="0" w:after="80"/>
+        <w:spacing w:after="80"/>
       </w:pPr>
     </w:p>
     <w:p>
@@ -3093,9 +3111,6 @@
             </w:tcMar>
           </w:tcPr>
           <w:p>
-            <w:pPr>
-              <w:spacing w:before="0" w:after="0"/>
-            </w:pPr>
             <w:r/>
             <w:r>
               <w:rPr>
@@ -3113,7 +3128,7 @@
     </w:tbl>
     <w:p>
       <w:pPr>
-        <w:spacing w:before="0" w:after="80"/>
+        <w:spacing w:after="80"/>
       </w:pPr>
     </w:p>
     <w:tbl>
@@ -4031,9 +4046,6 @@
             </w:tcMar>
           </w:tcPr>
           <w:p>
-            <w:pPr>
-              <w:spacing w:before="0" w:after="0"/>
-            </w:pPr>
             <w:r/>
             <w:r>
               <w:rPr>
@@ -4051,12 +4063,12 @@
     </w:tbl>
     <w:p>
       <w:pPr>
-        <w:spacing w:before="0" w:after="80"/>
+        <w:spacing w:after="80"/>
       </w:pPr>
     </w:p>
     <w:p>
       <w:pPr>
-        <w:spacing w:before="0" w:after="120" w:line="259" w:lineRule="auto"/>
+        <w:spacing w:before="0" w:after="80" w:line="259" w:lineRule="auto"/>
         <w:jc w:val="center"/>
       </w:pPr>
       <w:r>
@@ -4067,19 +4079,19 @@
           <w:color w:val="4A5563"/>
           <w:sz w:val="18"/>
         </w:rPr>
-        <w:t>Gráfico del recorrido obligatorio una vez notificada la pérdida, extravío o deterioro de una historia clínica.</w:t>
+        <w:t>Gráfico del recorrido obligatorio en el Hospital General Puyo una vez notificada la pérdida, extravío o deterioro de una historia clínica.</w:t>
       </w:r>
     </w:p>
     <w:p>
       <w:pPr>
-        <w:spacing w:before="0" w:after="120"/>
+        <w:spacing w:before="0" w:after="80"/>
         <w:jc w:val="center"/>
       </w:pPr>
       <w:r>
         <w:drawing>
           <wp:inline xmlns:a="http://schemas.openxmlformats.org/drawingml/2006/main" xmlns:pic="http://schemas.openxmlformats.org/drawingml/2006/picture">
-            <wp:extent cx="5940000" cy="7796250"/>
-            <wp:docPr id="1" name="Picture 1"/>
+            <wp:extent cx="6048000" cy="8769600"/>
+            <wp:docPr id="2" name="Picture 2"/>
             <wp:cNvGraphicFramePr>
               <a:graphicFrameLocks noChangeAspect="1"/>
             </wp:cNvGraphicFramePr>
@@ -4091,7 +4103,7 @@
                     <pic:cNvPicPr/>
                   </pic:nvPicPr>
                   <pic:blipFill>
-                    <a:blip r:embed="rId11"/>
+                    <a:blip r:embed="rId12"/>
                     <a:stretch>
                       <a:fillRect/>
                     </a:stretch>
@@ -4099,7 +4111,7 @@
                   <pic:spPr>
                     <a:xfrm>
                       <a:off x="0" y="0"/>
-                      <a:ext cx="5940000" cy="7796250"/>
+                      <a:ext cx="6048000" cy="8769600"/>
                     </a:xfrm>
                     <a:prstGeom prst="rect"/>
                   </pic:spPr>
@@ -4137,9 +4149,6 @@
             </w:tcMar>
           </w:tcPr>
           <w:p>
-            <w:pPr>
-              <w:spacing w:before="0" w:after="0"/>
-            </w:pPr>
             <w:r/>
             <w:r>
               <w:rPr>
@@ -4192,9 +4201,6 @@
             </w:tcMar>
           </w:tcPr>
           <w:p>
-            <w:pPr>
-              <w:spacing w:before="0" w:after="0"/>
-            </w:pPr>
             <w:r/>
             <w:r>
               <w:rPr>
@@ -4212,7 +4218,7 @@
     </w:tbl>
     <w:p>
       <w:pPr>
-        <w:spacing w:before="0" w:after="80"/>
+        <w:spacing w:after="80"/>
       </w:pPr>
     </w:p>
     <w:p>
@@ -4372,7 +4378,7 @@
           <w:color w:val="4A5563"/>
           <w:sz w:val="20"/>
         </w:rPr>
-        <w:t>La máxima autoridad o quien delegue activa el plan de contingencia del establecimiento.</w:t>
+        <w:t>La máxima autoridad del Hospital General Puyo o quien delegue activa el plan de contingencia.</w:t>
       </w:r>
     </w:p>
     <w:p>
@@ -5101,9 +5107,6 @@
             </w:tcMar>
           </w:tcPr>
           <w:p>
-            <w:pPr>
-              <w:spacing w:before="0" w:after="0"/>
-            </w:pPr>
             <w:r/>
             <w:r>
               <w:rPr>
@@ -5272,9 +5275,6 @@
             </w:tcMar>
           </w:tcPr>
           <w:p>
-            <w:pPr>
-              <w:spacing w:before="0" w:after="0"/>
-            </w:pPr>
             <w:r/>
             <w:r>
               <w:rPr>
@@ -5539,9 +5539,6 @@
             </w:tcMar>
           </w:tcPr>
           <w:p>
-            <w:pPr>
-              <w:spacing w:before="0" w:after="0"/>
-            </w:pPr>
             <w:r/>
             <w:r>
               <w:rPr>
@@ -5559,7 +5556,7 @@
     </w:tbl>
     <w:p>
       <w:pPr>
-        <w:spacing w:before="0" w:after="80"/>
+        <w:spacing w:after="80"/>
       </w:pPr>
     </w:p>
     <w:tbl>
@@ -6091,9 +6088,6 @@
             </w:tcMar>
           </w:tcPr>
           <w:p>
-            <w:pPr>
-              <w:spacing w:before="0" w:after="0"/>
-            </w:pPr>
             <w:r/>
             <w:r>
               <w:rPr>
@@ -6111,7 +6105,7 @@
     </w:tbl>
     <w:p>
       <w:pPr>
-        <w:spacing w:before="0" w:after="80"/>
+        <w:spacing w:after="80"/>
       </w:pPr>
     </w:p>
     <w:p>
@@ -6127,7 +6121,7 @@
           <w:color w:val="4A5563"/>
           <w:sz w:val="16"/>
         </w:rPr>
-        <w:t>Formularios CONFIDENCIALES. Conservar firmados en el expediente INC-HC-AAAA-###. Contacto: 0991976454</w:t>
+        <w:t>Formularios CONFIDENCIALES del Hospital General Puyo. Conservar firmados en el expediente INC-HC-AAAA-###. Contacto: 0991976454</w:t>
       </w:r>
     </w:p>
     <w:p>
@@ -6192,9 +6186,9 @@
                 <w:b/>
                 <w:i w:val="0"/>
                 <w:color w:val="FFFFFF"/>
-                <w:sz w:val="18"/>
+                <w:sz w:val="16"/>
               </w:rPr>
-              <w:t>PROT-HC-001</w:t>
+              <w:t>Hospital General Puyo  ·  PROT-HC-001</w:t>
             </w:r>
           </w:p>
         </w:tc>
@@ -7055,9 +7049,9 @@
                 <w:b/>
                 <w:i w:val="0"/>
                 <w:color w:val="FFFFFF"/>
-                <w:sz w:val="18"/>
+                <w:sz w:val="16"/>
               </w:rPr>
-              <w:t>PROT-HC-001</w:t>
+              <w:t>Hospital General Puyo  ·  PROT-HC-001</w:t>
             </w:r>
           </w:p>
         </w:tc>
@@ -7975,9 +7969,9 @@
                 <w:b/>
                 <w:i w:val="0"/>
                 <w:color w:val="FFFFFF"/>
-                <w:sz w:val="18"/>
+                <w:sz w:val="16"/>
               </w:rPr>
-              <w:t>PROT-HC-001</w:t>
+              <w:t>Hospital General Puyo  ·  PROT-HC-001</w:t>
             </w:r>
           </w:p>
         </w:tc>
@@ -8712,9 +8706,9 @@
                 <w:b/>
                 <w:i w:val="0"/>
                 <w:color w:val="FFFFFF"/>
-                <w:sz w:val="18"/>
+                <w:sz w:val="16"/>
               </w:rPr>
-              <w:t>PROT-HC-001</w:t>
+              <w:t>Hospital General Puyo  ·  PROT-HC-001</w:t>
             </w:r>
           </w:p>
         </w:tc>
@@ -9005,9 +8999,6 @@
             </w:tcMar>
           </w:tcPr>
           <w:p>
-            <w:pPr>
-              <w:spacing w:before="0" w:after="0"/>
-            </w:pPr>
             <w:r/>
             <w:r>
               <w:rPr>
@@ -9314,9 +9305,9 @@
                 <w:b/>
                 <w:i w:val="0"/>
                 <w:color w:val="FFFFFF"/>
-                <w:sz w:val="18"/>
+                <w:sz w:val="16"/>
               </w:rPr>
-              <w:t>PROT-HC-001</w:t>
+              <w:t>Hospital General Puyo  ·  PROT-HC-001</w:t>
             </w:r>
           </w:p>
         </w:tc>
@@ -9748,9 +9739,9 @@
                 <w:b/>
                 <w:i w:val="0"/>
                 <w:color w:val="FFFFFF"/>
-                <w:sz w:val="18"/>
+                <w:sz w:val="16"/>
               </w:rPr>
-              <w:t>PROT-HC-001</w:t>
+              <w:t>Hospital General Puyo  ·  PROT-HC-001</w:t>
             </w:r>
           </w:p>
         </w:tc>
@@ -10491,9 +10482,6 @@
             </w:tcMar>
           </w:tcPr>
           <w:p>
-            <w:pPr>
-              <w:spacing w:before="0" w:after="0"/>
-            </w:pPr>
             <w:r/>
             <w:r>
               <w:rPr>
@@ -10514,7 +10502,7 @@
                 <w:color w:val="4A5563"/>
                 <w:sz w:val="18"/>
               </w:rPr>
-              <w:t>Expediente del incidente en área restringida / custodia institucional.</w:t>
+              <w:t>Expediente del incidente en área restringida / custodia institucional del Hospital General Puyo.</w:t>
             </w:r>
           </w:p>
         </w:tc>
@@ -10587,9 +10575,9 @@
                 <w:b/>
                 <w:i w:val="0"/>
                 <w:color w:val="FFFFFF"/>
-                <w:sz w:val="18"/>
+                <w:sz w:val="16"/>
               </w:rPr>
-              <w:t>PROT-HC-001</w:t>
+              <w:t>Hospital General Puyo  ·  PROT-HC-001</w:t>
             </w:r>
           </w:p>
         </w:tc>
@@ -11069,9 +11057,6 @@
             </w:tcMar>
           </w:tcPr>
           <w:p>
-            <w:pPr>
-              <w:spacing w:before="0" w:after="0"/>
-            </w:pPr>
             <w:r/>
             <w:r>
               <w:rPr>
@@ -11165,9 +11150,9 @@
                 <w:b/>
                 <w:i w:val="0"/>
                 <w:color w:val="FFFFFF"/>
-                <w:sz w:val="18"/>
+                <w:sz w:val="16"/>
               </w:rPr>
-              <w:t>PROT-HC-001</w:t>
+              <w:t>Hospital General Puyo  ·  PROT-HC-001</w:t>
             </w:r>
           </w:p>
         </w:tc>
@@ -11258,7 +11243,7 @@
           <w:color w:val="4A5563"/>
           <w:sz w:val="18"/>
         </w:rPr>
-        <w:t>☐  Plan de contingencia del establecimiento actualizado</w:t>
+        <w:t>☐  Plan de contingencia del Hospital General Puyo actualizado</w:t>
       </w:r>
     </w:p>
     <w:p>
@@ -11547,7 +11532,7 @@
           <w:color w:val="0D6E6E"/>
           <w:sz w:val="20"/>
         </w:rPr>
-        <w:t>☎  Teléfono de contacto: 0991976454</w:t>
+        <w:t>☎  Contacto: 0991976454  ·  Hospital General Puyo  ·  MSP Ecuador</w:t>
       </w:r>
     </w:p>
     <w:p>
@@ -11567,8 +11552,8 @@
       </w:r>
     </w:p>
     <w:sectPr>
-      <w:headerReference w:type="default" r:id="rId9"/>
-      <w:footerReference w:type="default" r:id="rId10"/>
+      <w:headerReference w:type="default" r:id="rId10"/>
+      <w:footerReference w:type="default" r:id="rId11"/>
       <w:pgSz w:w="12240" w:h="15840"/>
       <w:pgMar w:top="794" w:right="1020" w:bottom="794" w:left="1020" w:header="720" w:footer="720" w:gutter="0"/>
       <w:cols w:space="720"/>
@@ -11593,10 +11578,7 @@
         <w:color w:val="4A5563"/>
         <w:sz w:val="14"/>
       </w:rPr>
-      <w:t xml:space="preserve">Contacto: 0991976454   ·   Página </w:t>
-    </w:r>
-    <w:r>
-      <w:fldChar w:fldCharType="begin"/>
+      <w:t xml:space="preserve">MSP  ·  Contacto: 0991976454   ·   Página </w:t>
     </w:r>
     <w:r>
       <w:rPr>
@@ -11606,10 +11588,7 @@
         <w:color w:val="4A5563"/>
         <w:sz w:val="14"/>
       </w:rPr>
-      <w:instrText xml:space="preserve"> PAGE </w:instrText>
-    </w:r>
-    <w:r>
-      <w:fldChar w:fldCharType="end"/>
+      <w:fldChar w:fldCharType="begin"/>
     </w:r>
     <w:r>
       <w:rPr>
@@ -11619,10 +11598,7 @@
         <w:color w:val="4A5563"/>
         <w:sz w:val="14"/>
       </w:rPr>
-      <w:t xml:space="preserve"> de </w:t>
-    </w:r>
-    <w:r>
-      <w:fldChar w:fldCharType="begin"/>
+      <w:instrText xml:space="preserve"> PAGE </w:instrText>
     </w:r>
     <w:r>
       <w:rPr>
@@ -11632,9 +11608,46 @@
         <w:color w:val="4A5563"/>
         <w:sz w:val="14"/>
       </w:rPr>
+      <w:fldChar w:fldCharType="end"/>
+    </w:r>
+    <w:r>
+      <w:rPr>
+        <w:rFonts w:ascii="Calibri" w:hAnsi="Calibri" w:eastAsia="Calibri"/>
+        <w:b w:val="0"/>
+        <w:i w:val="0"/>
+        <w:color w:val="4A5563"/>
+        <w:sz w:val="14"/>
+      </w:rPr>
+      <w:t xml:space="preserve"> de </w:t>
+    </w:r>
+    <w:r>
+      <w:rPr>
+        <w:rFonts w:ascii="Calibri" w:hAnsi="Calibri" w:eastAsia="Calibri"/>
+        <w:b w:val="0"/>
+        <w:i w:val="0"/>
+        <w:color w:val="4A5563"/>
+        <w:sz w:val="14"/>
+      </w:rPr>
+      <w:fldChar w:fldCharType="begin"/>
+    </w:r>
+    <w:r>
+      <w:rPr>
+        <w:rFonts w:ascii="Calibri" w:hAnsi="Calibri" w:eastAsia="Calibri"/>
+        <w:b w:val="0"/>
+        <w:i w:val="0"/>
+        <w:color w:val="4A5563"/>
+        <w:sz w:val="14"/>
+      </w:rPr>
       <w:instrText xml:space="preserve"> NUMPAGES </w:instrText>
     </w:r>
     <w:r>
+      <w:rPr>
+        <w:rFonts w:ascii="Calibri" w:hAnsi="Calibri" w:eastAsia="Calibri"/>
+        <w:b w:val="0"/>
+        <w:i w:val="0"/>
+        <w:color w:val="4A5563"/>
+        <w:sz w:val="14"/>
+      </w:rPr>
       <w:fldChar w:fldCharType="end"/>
     </w:r>
   </w:p>
@@ -11659,7 +11672,7 @@
         <w:color w:val="0D6E6E"/>
         <w:sz w:val="14"/>
       </w:rPr>
-      <w:t>PROT-HC-001  ·  Protocolo de Pérdida de Historia Clínica  ·  CONFIDENCIAL</w:t>
+      <w:t>PROT-HC-001  ·  Hospital General Puyo  ·  CONFIDENCIAL</w:t>
     </w:r>
   </w:p>
 </w:hdr>

</xml_diff>